<commit_message>
Embed configuration surfaces visual in part 2
</commit_message>
<xml_diff>
--- a/medium/generated/agentic-ai-engineering/2026-09-01-part-02-the-six-configuration-surfaces-of-an-agent.docx
+++ b/medium/generated/agentic-ai-engineering/2026-09-01-part-02-the-six-configuration-surfaces-of-an-agent.docx
@@ -1421,39 +1421,68 @@
     <w:p>
       <w:pPr>
         <w:pStyle w:val="Heading1"/>
+        <w:keepNext/>
+        <w:pageBreakBefore/>
       </w:pPr>
       <w:r>
-        <w:t>Visual Guidance</w:t>
+        <w:t>Visual Explanation</w:t>
       </w:r>
     </w:p>
     <w:p>
+      <w:pPr>
+        <w:keepNext/>
+        <w:spacing w:after="160"/>
+      </w:pPr>
       <w:r>
-        <w:rPr>
-          <w:rFonts w:ascii="Calibri" w:hAnsi="Calibri"/>
-          <w:sz w:val="22"/>
-        </w:rPr>
-        <w:t xml:space="preserve">Create a </w:t>
+        <w:t>The diagram shows the bounded agent loop and six surrounding control surfaces. The version boundary marks the complete tested release; the run trace records its resolved configuration.</w:t>
       </w:r>
+    </w:p>
+    <w:p>
+      <w:pPr>
+        <w:keepNext/>
+        <w:spacing w:before="80" w:after="120"/>
+        <w:jc w:val="center"/>
+      </w:pPr>
       <w:r>
-        <w:rPr>
-          <w:rFonts w:ascii="Calibri" w:hAnsi="Calibri"/>
-          <w:b/>
-          <w:sz w:val="22"/>
-        </w:rPr>
-        <w:t>configuration surface diagram</w:t>
-      </w:r>
-      <w:r>
-        <w:rPr>
-          <w:rFonts w:ascii="Calibri" w:hAnsi="Calibri"/>
-          <w:sz w:val="22"/>
-        </w:rPr>
-        <w:t xml:space="preserve"> with a bounded agent loop in the center and six surrounding panels: Prompt Policy, Tool Action Space, Model Envelope, Retrieval Evidence Window, Runtime Guardrails, and Memory Lifetimes. Connect each panel to the loop. Add a version tag around the complete configuration and show a run trace recording the resolved value from every surface.</w:t>
+        <w:drawing>
+          <wp:inline xmlns:a="http://schemas.openxmlformats.org/drawingml/2006/main" xmlns:pic="http://schemas.openxmlformats.org/drawingml/2006/picture">
+            <wp:extent cx="5715000" cy="3571875"/>
+            <wp:docPr id="1" name="Picture 1" title="Figure 1. The six configuration surfaces of an agent" descr="Diagram of an agent loop surrounded by six configuration panels for prompts, tools, model, retrieval, guardrails, and memory, all enclosed by one version boundary and recorded in a run trace."/>
+            <wp:cNvGraphicFramePr>
+              <a:graphicFrameLocks noChangeAspect="1"/>
+            </wp:cNvGraphicFramePr>
+            <a:graphic>
+              <a:graphicData uri="http://schemas.openxmlformats.org/drawingml/2006/picture">
+                <pic:pic>
+                  <pic:nvPicPr>
+                    <pic:cNvPr id="0" name="agentic-ai-engineering-part-02-config-surfaces.png"/>
+                    <pic:cNvPicPr/>
+                  </pic:nvPicPr>
+                  <pic:blipFill>
+                    <a:blip r:embed="rId11"/>
+                    <a:stretch>
+                      <a:fillRect/>
+                    </a:stretch>
+                  </pic:blipFill>
+                  <pic:spPr>
+                    <a:xfrm>
+                      <a:off x="0" y="0"/>
+                      <a:ext cx="5715000" cy="3571875"/>
+                    </a:xfrm>
+                    <a:prstGeom prst="rect"/>
+                  </pic:spPr>
+                </pic:pic>
+              </a:graphicData>
+            </a:graphic>
+          </wp:inline>
+        </w:drawing>
       </w:r>
     </w:p>
     <w:p>
       <w:pPr>
         <w:spacing w:before="60" w:after="120"/>
         <w:ind w:left="288" w:right="288"/>
+        <w:keepNext/>
         <w:shd w:fill="F4F6F9"/>
       </w:pPr>
       <w:r>
@@ -1476,8 +1505,9 @@
     </w:p>
     <w:p>
       <w:pPr>
-        <w:spacing w:before="60" w:after="120"/>
+        <w:spacing w:before="60" w:after="200"/>
         <w:ind w:left="288" w:right="288"/>
+        <w:keepNext w:val="0"/>
         <w:shd w:fill="F4F6F9"/>
       </w:pPr>
       <w:r>

</xml_diff>